<commit_message>
v31 - Atualizacao do app
</commit_message>
<xml_diff>
--- a/comando de deploy.docx
+++ b/comando de deploy.docx
@@ -10,7 +10,15 @@
         </w:numPr>
       </w:pPr>
       <w:r>
-        <w:t>No VS Code, abra o </w:t>
+        <w:t xml:space="preserve">No VS </w:t>
+      </w:r>
+      <w:proofErr w:type="spellStart"/>
+      <w:r>
+        <w:t>Code</w:t>
+      </w:r>
+      <w:proofErr w:type="spellEnd"/>
+      <w:r>
+        <w:t>, abra o </w:t>
       </w:r>
       <w:r>
         <w:rPr>
@@ -37,7 +45,15 @@
         </w:numPr>
       </w:pPr>
       <w:r>
-        <w:t>Digite e pressione Enter:</w:t>
+        <w:t xml:space="preserve">Digite e pressione </w:t>
+      </w:r>
+      <w:proofErr w:type="spellStart"/>
+      <w:r>
+        <w:t>Enter</w:t>
+      </w:r>
+      <w:proofErr w:type="spellEnd"/>
+      <w:r>
+        <w:t>:</w:t>
       </w:r>
     </w:p>
     <w:p>
@@ -74,8 +90,88 @@
     </w:p>
     <w:p>
       <w:r>
-        <w:t>É isso! Sempre que quiser atualizar o app dos alunos, basta digitar esse comando no terminal do VS Code.</w:t>
-      </w:r>
+        <w:t xml:space="preserve">É isso! Sempre que quiser atualizar o app dos alunos, basta digitar esse comando no terminal do VS </w:t>
+      </w:r>
+      <w:proofErr w:type="spellStart"/>
+      <w:r>
+        <w:t>Code</w:t>
+      </w:r>
+      <w:proofErr w:type="spellEnd"/>
+      <w:r>
+        <w:t>.</w:t>
+      </w:r>
+    </w:p>
+    <w:p/>
+    <w:p>
+      <w:r>
+        <w:t>---------------------------------------------------------</w:t>
+      </w:r>
+    </w:p>
+    <w:p>
+      <w:r>
+        <w:t>Instalação dos app</w:t>
+      </w:r>
+      <w:r>
+        <w:br/>
+      </w:r>
+      <w:r>
+        <w:br/>
+      </w:r>
+      <w:r>
+        <w:t>O repositório está em mkodgssjb27-sketch/</w:t>
+      </w:r>
+      <w:proofErr w:type="spellStart"/>
+      <w:r>
+        <w:t>overlabs</w:t>
+      </w:r>
+      <w:proofErr w:type="spellEnd"/>
+      <w:r>
+        <w:t>. Se o GitHub Pages está ativado (</w:t>
+      </w:r>
+      <w:proofErr w:type="spellStart"/>
+      <w:r>
+        <w:t>branch</w:t>
+      </w:r>
+      <w:proofErr w:type="spellEnd"/>
+      <w:r>
+        <w:t xml:space="preserve"> </w:t>
+      </w:r>
+      <w:proofErr w:type="spellStart"/>
+      <w:r>
+        <w:t>main</w:t>
+      </w:r>
+      <w:proofErr w:type="spellEnd"/>
+      <w:r>
+        <w:t>), os links são:</w:t>
+      </w:r>
+    </w:p>
+    <w:p/>
+    <w:p>
+      <w:r>
+        <w:t xml:space="preserve">App do Aluno: </w:t>
+      </w:r>
+      <w:hyperlink r:id="rId5" w:history="1">
+        <w:r>
+          <w:rPr>
+            <w:rStyle w:val="Hyperlink"/>
+          </w:rPr>
+          <w:t>https://mkodgssjb27-sketch.github.io/overlabs/aluno.html</w:t>
+        </w:r>
+      </w:hyperlink>
+    </w:p>
+    <w:p/>
+    <w:p>
+      <w:r>
+        <w:t xml:space="preserve">App do Professor: </w:t>
+      </w:r>
+      <w:hyperlink r:id="rId6" w:history="1">
+        <w:r>
+          <w:rPr>
+            <w:rStyle w:val="Hyperlink"/>
+          </w:rPr>
+          <w:t>https://mkodgssjb27-sketch.github.io/overlabs/professor.html</w:t>
+        </w:r>
+      </w:hyperlink>
     </w:p>
     <w:p/>
     <w:sectPr>
@@ -964,6 +1060,7 @@
   <w:style w:type="character" w:default="1" w:styleId="Fontepargpadro">
     <w:name w:val="Default Paragraph Font"/>
     <w:uiPriority w:val="1"/>
+    <w:semiHidden/>
     <w:unhideWhenUsed/>
   </w:style>
   <w:style w:type="table" w:default="1" w:styleId="Tabelanormal">
@@ -1275,6 +1372,29 @@
       <w:smallCaps/>
       <w:color w:val="0F4761" w:themeColor="accent1" w:themeShade="BF"/>
       <w:spacing w:val="5"/>
+    </w:rPr>
+  </w:style>
+  <w:style w:type="character" w:styleId="Hyperlink">
+    <w:name w:val="Hyperlink"/>
+    <w:basedOn w:val="Fontepargpadro"/>
+    <w:uiPriority w:val="99"/>
+    <w:unhideWhenUsed/>
+    <w:rsid w:val="00905511"/>
+    <w:rPr>
+      <w:color w:val="467886" w:themeColor="hyperlink"/>
+      <w:u w:val="single"/>
+    </w:rPr>
+  </w:style>
+  <w:style w:type="character" w:styleId="MenoPendente">
+    <w:name w:val="Unresolved Mention"/>
+    <w:basedOn w:val="Fontepargpadro"/>
+    <w:uiPriority w:val="99"/>
+    <w:semiHidden/>
+    <w:unhideWhenUsed/>
+    <w:rsid w:val="00905511"/>
+    <w:rPr>
+      <w:color w:val="605E5C"/>
+      <w:shd w:val="clear" w:color="auto" w:fill="E1DFDD"/>
     </w:rPr>
   </w:style>
 </w:styles>

</xml_diff>

<commit_message>
v42 - Push apenas por feed, nao sininho + notif waitlist promotion
</commit_message>
<xml_diff>
--- a/comando de deploy.docx
+++ b/comando de deploy.docx
@@ -10,15 +10,7 @@
         </w:numPr>
       </w:pPr>
       <w:r>
-        <w:t xml:space="preserve">No VS </w:t>
-      </w:r>
-      <w:proofErr w:type="spellStart"/>
-      <w:r>
-        <w:t>Code</w:t>
-      </w:r>
-      <w:proofErr w:type="spellEnd"/>
-      <w:r>
-        <w:t>, abra o </w:t>
+        <w:t>No VS Code, abra o </w:t>
       </w:r>
       <w:r>
         <w:rPr>
@@ -45,15 +37,7 @@
         </w:numPr>
       </w:pPr>
       <w:r>
-        <w:t xml:space="preserve">Digite e pressione </w:t>
-      </w:r>
-      <w:proofErr w:type="spellStart"/>
-      <w:r>
-        <w:t>Enter</w:t>
-      </w:r>
-      <w:proofErr w:type="spellEnd"/>
-      <w:r>
-        <w:t>:</w:t>
+        <w:t>Digite e pressione Enter:</w:t>
       </w:r>
     </w:p>
     <w:p>
@@ -90,15 +74,7 @@
     </w:p>
     <w:p>
       <w:r>
-        <w:t xml:space="preserve">É isso! Sempre que quiser atualizar o app dos alunos, basta digitar esse comando no terminal do VS </w:t>
-      </w:r>
-      <w:proofErr w:type="spellStart"/>
-      <w:r>
-        <w:t>Code</w:t>
-      </w:r>
-      <w:proofErr w:type="spellEnd"/>
-      <w:r>
-        <w:t>.</w:t>
+        <w:t>É isso! Sempre que quiser atualizar o app dos alunos, basta digitar esse comando no terminal do VS Code.</w:t>
       </w:r>
     </w:p>
     <w:p/>
@@ -116,33 +92,7 @@
       </w:r>
       <w:r>
         <w:br/>
-      </w:r>
-      <w:r>
-        <w:t>O repositório está em mkodgssjb27-sketch/</w:t>
-      </w:r>
-      <w:proofErr w:type="spellStart"/>
-      <w:r>
-        <w:t>overlabs</w:t>
-      </w:r>
-      <w:proofErr w:type="spellEnd"/>
-      <w:r>
-        <w:t>. Se o GitHub Pages está ativado (</w:t>
-      </w:r>
-      <w:proofErr w:type="spellStart"/>
-      <w:r>
-        <w:t>branch</w:t>
-      </w:r>
-      <w:proofErr w:type="spellEnd"/>
-      <w:r>
-        <w:t xml:space="preserve"> </w:t>
-      </w:r>
-      <w:proofErr w:type="spellStart"/>
-      <w:r>
-        <w:t>main</w:t>
-      </w:r>
-      <w:proofErr w:type="spellEnd"/>
-      <w:r>
-        <w:t>), os links são:</w:t>
+        <w:t>O repositório está em mkodgssjb27-sketch/overlabs. Se o GitHub Pages está ativado (branch main), os links são:</w:t>
       </w:r>
     </w:p>
     <w:p/>
@@ -174,6 +124,84 @@
       </w:hyperlink>
     </w:p>
     <w:p/>
+    <w:p>
+      <w:r>
+        <w:t>No app do professor, na função presenças, quero que apresente o nome de todos alunos(usuários) cadastrados, assim que eu clicar em um determinado aluno, aparecerá duas opções, lançar presença e relatório de presença, em lançar presença abrirá um calendário de datas, irei selecionar a data do dia que quiser e colocar o período de horário que o aluno treinou, logo após isso, eu possa clicar no botão salvar, isso fará com que salve a presença daquele aluno naquele dia de treino, naquele período de horário horário.</w:t>
+      </w:r>
+      <w:r>
+        <w:br/>
+        <w:t xml:space="preserve"> clicando em histórico de presenças eu vejo as estatísticas daquele aluno, quantos treinos ele compareceu dentro de cada mês que eu selecionar.</w:t>
+      </w:r>
+      <w:r>
+        <w:br/>
+        <w:t xml:space="preserve"> clicando na função torneios dentro do app do professor, gostaria que houvessem </w:t>
+      </w:r>
+      <w:r>
+        <w:t>5</w:t>
+      </w:r>
+      <w:r>
+        <w:t xml:space="preserve"> botões, criar inscrição,</w:t>
+      </w:r>
+      <w:r>
+        <w:t xml:space="preserve"> Consultar inscrição,</w:t>
+      </w:r>
+      <w:r>
+        <w:t xml:space="preserve"> criar torneio,</w:t>
+      </w:r>
+      <w:r>
+        <w:t xml:space="preserve"> consultar torneio,</w:t>
+      </w:r>
+      <w:r>
+        <w:t xml:space="preserve"> criar tabela de torneio</w:t>
+      </w:r>
+      <w:r>
+        <w:t>, consultar tabela.</w:t>
+      </w:r>
+      <w:r>
+        <w:br/>
+      </w:r>
+      <w:r>
+        <w:lastRenderedPageBreak/>
+        <w:t xml:space="preserve"> em criar inscrição terei a possibilidade de criar o título da inscrição e confirmar, mais para frente essa inscrição criada irá aparecer no app aluno na aba torneios dentro do botão inscrições, ficará disponível para o aluno se inscrever colocando os seguintes dados</w:t>
+      </w:r>
+      <w:r>
+        <w:t xml:space="preserve">: </w:t>
+      </w:r>
+      <w:r>
+        <w:t>Nome Completo</w:t>
+      </w:r>
+      <w:r>
+        <w:t xml:space="preserve"> e Idade.</w:t>
+      </w:r>
+      <w:r>
+        <w:br/>
+        <w:t xml:space="preserve"> em consultar inscrição eu poderei selecionar uma inscrição criada, clicar nela e ver quem se inscreveu.</w:t>
+      </w:r>
+      <w:r>
+        <w:br/>
+        <w:t>em criar torneio, consultar torneio, criar tabela e consultar tabela irei deixar para explicar como irá funcionar depois, pois ainda estou idealizando como vai funcionar</w:t>
+      </w:r>
+    </w:p>
+    <w:p/>
+    <w:p/>
+    <w:p/>
+    <w:p>
+      <w:r>
+        <w:t>----------------------------------------------------------</w:t>
+      </w:r>
+      <w:r>
+        <w:br/>
+        <w:t xml:space="preserve"> será que consigo criar um arquivo em html que faça a ligação e espelhamento do meu programa de entregas? </w:t>
+      </w:r>
+      <w:r>
+        <w:br/>
+        <w:t xml:space="preserve"> irei explicar o que eu quero, gostaria de um arquivo em html ou aplicativo capas de visualizar(apenas visualizar) todas entregas criadas, no mesmo aspecto do programa, com o calendário mensal capaz de visualizar em semanal e também em diário, onde eu consiga abrir a entrega criada e visualizar para quem ela foi criada, quais são os materiais que já foram, que ainda faltam, se ela será entrega por caminhão ou por carroça e se a nota fiscal foi emitida e se foi pago ou não.</w:t>
+      </w:r>
+      <w:r>
+        <w:br/>
+        <w:t xml:space="preserve"> gostaria dessa portabilidade para adicionar e visualizar meu programa de entregas pelo telefone.</w:t>
+      </w:r>
+    </w:p>
     <w:sectPr>
       <w:pgSz w:w="11906" w:h="16838"/>
       <w:pgMar w:top="1417" w:right="1701" w:bottom="1417" w:left="1701" w:header="708" w:footer="708" w:gutter="0"/>

</xml_diff>

<commit_message>
v43 - Atualizacao do app
</commit_message>
<xml_diff>
--- a/comando de deploy.docx
+++ b/comando de deploy.docx
@@ -10,7 +10,15 @@
         </w:numPr>
       </w:pPr>
       <w:r>
-        <w:t>No VS Code, abra o </w:t>
+        <w:t xml:space="preserve">No VS </w:t>
+      </w:r>
+      <w:proofErr w:type="spellStart"/>
+      <w:r>
+        <w:t>Code</w:t>
+      </w:r>
+      <w:proofErr w:type="spellEnd"/>
+      <w:r>
+        <w:t>, abra o </w:t>
       </w:r>
       <w:r>
         <w:rPr>
@@ -37,7 +45,15 @@
         </w:numPr>
       </w:pPr>
       <w:r>
-        <w:t>Digite e pressione Enter:</w:t>
+        <w:t xml:space="preserve">Digite e pressione </w:t>
+      </w:r>
+      <w:proofErr w:type="spellStart"/>
+      <w:r>
+        <w:t>Enter</w:t>
+      </w:r>
+      <w:proofErr w:type="spellEnd"/>
+      <w:r>
+        <w:t>:</w:t>
       </w:r>
     </w:p>
     <w:p>
@@ -74,7 +90,15 @@
     </w:p>
     <w:p>
       <w:r>
-        <w:t>É isso! Sempre que quiser atualizar o app dos alunos, basta digitar esse comando no terminal do VS Code.</w:t>
+        <w:t xml:space="preserve">É isso! Sempre que quiser atualizar o app dos alunos, basta digitar esse comando no terminal do VS </w:t>
+      </w:r>
+      <w:proofErr w:type="spellStart"/>
+      <w:r>
+        <w:t>Code</w:t>
+      </w:r>
+      <w:proofErr w:type="spellEnd"/>
+      <w:r>
+        <w:t>.</w:t>
       </w:r>
     </w:p>
     <w:p/>
@@ -92,7 +116,31 @@
       </w:r>
       <w:r>
         <w:br/>
-        <w:t>O repositório está em mkodgssjb27-sketch/overlabs. Se o GitHub Pages está ativado (branch main), os links são:</w:t>
+        <w:t>O repositório está em mkodgssjb27-sketch/</w:t>
+      </w:r>
+      <w:proofErr w:type="spellStart"/>
+      <w:r>
+        <w:t>overlabs</w:t>
+      </w:r>
+      <w:proofErr w:type="spellEnd"/>
+      <w:r>
+        <w:t>. Se o GitHub Pages está ativado (</w:t>
+      </w:r>
+      <w:proofErr w:type="spellStart"/>
+      <w:r>
+        <w:t>branch</w:t>
+      </w:r>
+      <w:proofErr w:type="spellEnd"/>
+      <w:r>
+        <w:t xml:space="preserve"> </w:t>
+      </w:r>
+      <w:proofErr w:type="spellStart"/>
+      <w:r>
+        <w:t>main</w:t>
+      </w:r>
+      <w:proofErr w:type="spellEnd"/>
+      <w:r>
+        <w:t>), os links são:</w:t>
       </w:r>
     </w:p>
     <w:p/>
@@ -124,84 +172,6 @@
       </w:hyperlink>
     </w:p>
     <w:p/>
-    <w:p>
-      <w:r>
-        <w:t>No app do professor, na função presenças, quero que apresente o nome de todos alunos(usuários) cadastrados, assim que eu clicar em um determinado aluno, aparecerá duas opções, lançar presença e relatório de presença, em lançar presença abrirá um calendário de datas, irei selecionar a data do dia que quiser e colocar o período de horário que o aluno treinou, logo após isso, eu possa clicar no botão salvar, isso fará com que salve a presença daquele aluno naquele dia de treino, naquele período de horário horário.</w:t>
-      </w:r>
-      <w:r>
-        <w:br/>
-        <w:t xml:space="preserve"> clicando em histórico de presenças eu vejo as estatísticas daquele aluno, quantos treinos ele compareceu dentro de cada mês que eu selecionar.</w:t>
-      </w:r>
-      <w:r>
-        <w:br/>
-        <w:t xml:space="preserve"> clicando na função torneios dentro do app do professor, gostaria que houvessem </w:t>
-      </w:r>
-      <w:r>
-        <w:t>5</w:t>
-      </w:r>
-      <w:r>
-        <w:t xml:space="preserve"> botões, criar inscrição,</w:t>
-      </w:r>
-      <w:r>
-        <w:t xml:space="preserve"> Consultar inscrição,</w:t>
-      </w:r>
-      <w:r>
-        <w:t xml:space="preserve"> criar torneio,</w:t>
-      </w:r>
-      <w:r>
-        <w:t xml:space="preserve"> consultar torneio,</w:t>
-      </w:r>
-      <w:r>
-        <w:t xml:space="preserve"> criar tabela de torneio</w:t>
-      </w:r>
-      <w:r>
-        <w:t>, consultar tabela.</w:t>
-      </w:r>
-      <w:r>
-        <w:br/>
-      </w:r>
-      <w:r>
-        <w:lastRenderedPageBreak/>
-        <w:t xml:space="preserve"> em criar inscrição terei a possibilidade de criar o título da inscrição e confirmar, mais para frente essa inscrição criada irá aparecer no app aluno na aba torneios dentro do botão inscrições, ficará disponível para o aluno se inscrever colocando os seguintes dados</w:t>
-      </w:r>
-      <w:r>
-        <w:t xml:space="preserve">: </w:t>
-      </w:r>
-      <w:r>
-        <w:t>Nome Completo</w:t>
-      </w:r>
-      <w:r>
-        <w:t xml:space="preserve"> e Idade.</w:t>
-      </w:r>
-      <w:r>
-        <w:br/>
-        <w:t xml:space="preserve"> em consultar inscrição eu poderei selecionar uma inscrição criada, clicar nela e ver quem se inscreveu.</w:t>
-      </w:r>
-      <w:r>
-        <w:br/>
-        <w:t>em criar torneio, consultar torneio, criar tabela e consultar tabela irei deixar para explicar como irá funcionar depois, pois ainda estou idealizando como vai funcionar</w:t>
-      </w:r>
-    </w:p>
-    <w:p/>
-    <w:p/>
-    <w:p/>
-    <w:p>
-      <w:r>
-        <w:t>----------------------------------------------------------</w:t>
-      </w:r>
-      <w:r>
-        <w:br/>
-        <w:t xml:space="preserve"> será que consigo criar um arquivo em html que faça a ligação e espelhamento do meu programa de entregas? </w:t>
-      </w:r>
-      <w:r>
-        <w:br/>
-        <w:t xml:space="preserve"> irei explicar o que eu quero, gostaria de um arquivo em html ou aplicativo capas de visualizar(apenas visualizar) todas entregas criadas, no mesmo aspecto do programa, com o calendário mensal capaz de visualizar em semanal e também em diário, onde eu consiga abrir a entrega criada e visualizar para quem ela foi criada, quais são os materiais que já foram, que ainda faltam, se ela será entrega por caminhão ou por carroça e se a nota fiscal foi emitida e se foi pago ou não.</w:t>
-      </w:r>
-      <w:r>
-        <w:br/>
-        <w:t xml:space="preserve"> gostaria dessa portabilidade para adicionar e visualizar meu programa de entregas pelo telefone.</w:t>
-      </w:r>
-    </w:p>
     <w:sectPr>
       <w:pgSz w:w="11906" w:h="16838"/>
       <w:pgMar w:top="1417" w:right="1701" w:bottom="1417" w:left="1701" w:header="708" w:footer="708" w:gutter="0"/>

</xml_diff>

<commit_message>
v72 - Atualizacao do app
</commit_message>
<xml_diff>
--- a/comando de deploy.docx
+++ b/comando de deploy.docx
@@ -10,15 +10,7 @@
         </w:numPr>
       </w:pPr>
       <w:r>
-        <w:t xml:space="preserve">No VS </w:t>
-      </w:r>
-      <w:proofErr w:type="spellStart"/>
-      <w:r>
-        <w:t>Code</w:t>
-      </w:r>
-      <w:proofErr w:type="spellEnd"/>
-      <w:r>
-        <w:t>, abra o </w:t>
+        <w:t>No VS Code, abra o </w:t>
       </w:r>
       <w:r>
         <w:rPr>
@@ -45,15 +37,7 @@
         </w:numPr>
       </w:pPr>
       <w:r>
-        <w:t xml:space="preserve">Digite e pressione </w:t>
-      </w:r>
-      <w:proofErr w:type="spellStart"/>
-      <w:r>
-        <w:t>Enter</w:t>
-      </w:r>
-      <w:proofErr w:type="spellEnd"/>
-      <w:r>
-        <w:t>:</w:t>
+        <w:t>Digite e pressione Enter:</w:t>
       </w:r>
     </w:p>
     <w:p>
@@ -90,15 +74,7 @@
     </w:p>
     <w:p>
       <w:r>
-        <w:t xml:space="preserve">É isso! Sempre que quiser atualizar o app dos alunos, basta digitar esse comando no terminal do VS </w:t>
-      </w:r>
-      <w:proofErr w:type="spellStart"/>
-      <w:r>
-        <w:t>Code</w:t>
-      </w:r>
-      <w:proofErr w:type="spellEnd"/>
-      <w:r>
-        <w:t>.</w:t>
+        <w:t>É isso! Sempre que quiser atualizar o app dos alunos, basta digitar esse comando no terminal do VS Code.</w:t>
       </w:r>
     </w:p>
     <w:p/>
@@ -116,31 +92,7 @@
       </w:r>
       <w:r>
         <w:br/>
-        <w:t>O repositório está em mkodgssjb27-sketch/</w:t>
-      </w:r>
-      <w:proofErr w:type="spellStart"/>
-      <w:r>
-        <w:t>overlabs</w:t>
-      </w:r>
-      <w:proofErr w:type="spellEnd"/>
-      <w:r>
-        <w:t>. Se o GitHub Pages está ativado (</w:t>
-      </w:r>
-      <w:proofErr w:type="spellStart"/>
-      <w:r>
-        <w:t>branch</w:t>
-      </w:r>
-      <w:proofErr w:type="spellEnd"/>
-      <w:r>
-        <w:t xml:space="preserve"> </w:t>
-      </w:r>
-      <w:proofErr w:type="spellStart"/>
-      <w:r>
-        <w:t>main</w:t>
-      </w:r>
-      <w:proofErr w:type="spellEnd"/>
-      <w:r>
-        <w:t>), os links são:</w:t>
+        <w:t>O repositório está em mkodgssjb27-sketch/overlabs. Se o GitHub Pages está ativado (branch main), os links são:</w:t>
       </w:r>
     </w:p>
     <w:p/>
@@ -172,6 +124,140 @@
       </w:hyperlink>
     </w:p>
     <w:p/>
+    <w:p>
+      <w:pPr>
+        <w:pStyle w:val="PargrafodaLista"/>
+        <w:numPr>
+          <w:ilvl w:val="0"/>
+          <w:numId w:val="3"/>
+        </w:numPr>
+      </w:pPr>
+      <w:r>
+        <w:rPr>
+          <w:b/>
+          <w:bCs/>
+        </w:rPr>
+        <w:t>CUT</w:t>
+      </w:r>
+      <w:r>
+        <w:t xml:space="preserve"> – Agora seu aplicativo ficou mais dinâmico, implementada os CUT que são nada mais nada menos que as moedas que você pode acumular dentro do seu perfil no app da Over Labs, Você poderá usar Cuts para comprar Customizações para seu perfil na Loja.</w:t>
+      </w:r>
+      <w:r>
+        <w:br/>
+      </w:r>
+    </w:p>
+    <w:p>
+      <w:pPr>
+        <w:pStyle w:val="PargrafodaLista"/>
+        <w:numPr>
+          <w:ilvl w:val="0"/>
+          <w:numId w:val="3"/>
+        </w:numPr>
+      </w:pPr>
+      <w:r>
+        <w:rPr>
+          <w:b/>
+          <w:bCs/>
+        </w:rPr>
+        <w:t>PRESENÇAS</w:t>
+      </w:r>
+      <w:r>
+        <w:t xml:space="preserve"> – Agora na aba presenças você poderá acompanhar seu próprio Histórico de frequência, assim que o treino é finalizado, sua presença é lançada dentro do Aplicativo.</w:t>
+      </w:r>
+      <w:r>
+        <w:br/>
+        <w:t>ATENÇÃO! Presenças valerão CUTS (sistema de moeda dentro do Aplicativo), portanto, quanto mais presente nos treinos você é, mas moedas irá acumular.</w:t>
+      </w:r>
+    </w:p>
+    <w:p>
+      <w:pPr>
+        <w:pStyle w:val="PargrafodaLista"/>
+        <w:numPr>
+          <w:ilvl w:val="0"/>
+          <w:numId w:val="3"/>
+        </w:numPr>
+      </w:pPr>
+      <w:r>
+        <w:rPr>
+          <w:b/>
+          <w:bCs/>
+        </w:rPr>
+        <w:lastRenderedPageBreak/>
+        <w:t>TORNEIOS</w:t>
+      </w:r>
+      <w:r>
+        <w:t xml:space="preserve"> – Adicionada a opção Inscrições dentro da aba torneios, como funcionará: quando surgir um novo torneio, haverá uma ficha de inscrição com nome dele disponível para o aluno preencher e se inscrever para competir.</w:t>
+      </w:r>
+      <w:r>
+        <w:br/>
+      </w:r>
+      <w:r>
+        <w:br/>
+      </w:r>
+    </w:p>
+    <w:p>
+      <w:r>
+        <w:br/>
+      </w:r>
+      <w:r>
+        <w:t>VALORES DE MOEDAS CUT:</w:t>
+      </w:r>
+    </w:p>
+    <w:p>
+      <w:r>
+        <w:br/>
+      </w:r>
+      <w:r>
+        <w:t>Colocar Foto de Perfil – 1</w:t>
+      </w:r>
+      <w:r>
+        <w:br/>
+      </w:r>
+      <w:r>
+        <w:t>Treinar na Arena Cajueiro – 1</w:t>
+      </w:r>
+      <w:r>
+        <w:br/>
+      </w:r>
+      <w:r>
+        <w:t>Treinar na Arena Grussaí – 2</w:t>
+      </w:r>
+      <w:r>
+        <w:br/>
+      </w:r>
+      <w:r>
+        <w:t>Conseguir ir em uma Carona – 2</w:t>
+      </w:r>
+      <w:r>
+        <w:br/>
+      </w:r>
+      <w:r>
+        <w:t>Ficar em Terceiro em algum Torneio – 30</w:t>
+      </w:r>
+      <w:r>
+        <w:br/>
+      </w:r>
+      <w:r>
+        <w:t>Ficar Segundo em algum Torneio – 40</w:t>
+      </w:r>
+      <w:r>
+        <w:br/>
+      </w:r>
+      <w:r>
+        <w:t xml:space="preserve">Ser Campeão de Algum Torneio </w:t>
+      </w:r>
+      <w:r>
+        <w:t>–</w:t>
+      </w:r>
+      <w:r>
+        <w:t xml:space="preserve"> 50</w:t>
+      </w:r>
+    </w:p>
+    <w:p>
+      <w:r>
+        <w:t>Ser Campeão batendo em Federado – 70</w:t>
+      </w:r>
+    </w:p>
     <w:sectPr>
       <w:pgSz w:w="11906" w:h="16838"/>
       <w:pgMar w:top="1417" w:right="1701" w:bottom="1417" w:left="1701" w:header="708" w:footer="708" w:gutter="0"/>
@@ -185,6 +271,119 @@
 <file path=word/numbering.xml><?xml version="1.0" encoding="utf-8"?>
 <w:numbering xmlns:wpc="http://schemas.microsoft.com/office/word/2010/wordprocessingCanvas" xmlns:cx="http://schemas.microsoft.com/office/drawing/2014/chartex" xmlns:cx1="http://schemas.microsoft.com/office/drawing/2015/9/8/chartex" xmlns:cx2="http://schemas.microsoft.com/office/drawing/2015/10/21/chartex" xmlns:cx3="http://schemas.microsoft.com/office/drawing/2016/5/9/chartex" xmlns:cx4="http://schemas.microsoft.com/office/drawing/2016/5/10/chartex" xmlns:cx5="http://schemas.microsoft.com/office/drawing/2016/5/11/chartex" xmlns:cx6="http://schemas.microsoft.com/office/drawing/2016/5/12/chartex" xmlns:cx7="http://schemas.microsoft.com/office/drawing/2016/5/13/chartex" xmlns:cx8="http://schemas.microsoft.com/office/drawing/2016/5/14/chartex" xmlns:mc="http://schemas.openxmlformats.org/markup-compatibility/2006" xmlns:aink="http://schemas.microsoft.com/office/drawing/2016/ink" xmlns:am3d="http://schemas.microsoft.com/office/drawing/2017/model3d" xmlns:o="urn:schemas-microsoft-com:office:office" xmlns:oel="http://schemas.microsoft.com/office/2019/extlst" xmlns:r="http://schemas.openxmlformats.org/officeDocument/2006/relationships" xmlns:m="http://schemas.openxmlformats.org/officeDocument/2006/math" xmlns:v="urn:schemas-microsoft-com:vml" xmlns:wp14="http://schemas.microsoft.com/office/word/2010/wordprocessingDrawing" xmlns:wp="http://schemas.openxmlformats.org/drawingml/2006/wordprocessingDrawing" xmlns:w10="urn:schemas-microsoft-com:office:word" xmlns:w="http://schemas.openxmlformats.org/wordprocessingml/2006/main" xmlns:w14="http://schemas.microsoft.com/office/word/2010/wordml" xmlns:w15="http://schemas.microsoft.com/office/word/2012/wordml" xmlns:w16cex="http://schemas.microsoft.com/office/word/2018/wordml/cex" xmlns:w16cid="http://schemas.microsoft.com/office/word/2016/wordml/cid" xmlns:w16="http://schemas.microsoft.com/office/word/2018/wordml" xmlns:w16du="http://schemas.microsoft.com/office/word/2023/wordml/word16du" xmlns:w16sdtdh="http://schemas.microsoft.com/office/word/2020/wordml/sdtdatahash" xmlns:w16sdtfl="http://schemas.microsoft.com/office/word/2024/wordml/sdtformatlock" xmlns:w16se="http://schemas.microsoft.com/office/word/2015/wordml/symex" xmlns:wpg="http://schemas.microsoft.com/office/word/2010/wordprocessingGroup" xmlns:wpi="http://schemas.microsoft.com/office/word/2010/wordprocessingInk" xmlns:wne="http://schemas.microsoft.com/office/word/2006/wordml" xmlns:wps="http://schemas.microsoft.com/office/word/2010/wordprocessingShape" mc:Ignorable="w14 w15 w16se w16cid w16 w16cex w16sdtdh w16sdtfl w16du wp14">
   <w:abstractNum w:abstractNumId="0" w15:restartNumberingAfterBreak="0">
+    <w:nsid w:val="22524C54"/>
+    <w:multiLevelType w:val="hybridMultilevel"/>
+    <w:tmpl w:val="5636C4BC"/>
+    <w:lvl w:ilvl="0" w:tplc="04160001">
+      <w:start w:val="1"/>
+      <w:numFmt w:val="bullet"/>
+      <w:lvlText w:val=""/>
+      <w:lvlJc w:val="left"/>
+      <w:pPr>
+        <w:ind w:left="720" w:hanging="360"/>
+      </w:pPr>
+      <w:rPr>
+        <w:rFonts w:ascii="Symbol" w:hAnsi="Symbol" w:hint="default"/>
+      </w:rPr>
+    </w:lvl>
+    <w:lvl w:ilvl="1" w:tplc="04160003" w:tentative="1">
+      <w:start w:val="1"/>
+      <w:numFmt w:val="bullet"/>
+      <w:lvlText w:val="o"/>
+      <w:lvlJc w:val="left"/>
+      <w:pPr>
+        <w:ind w:left="1440" w:hanging="360"/>
+      </w:pPr>
+      <w:rPr>
+        <w:rFonts w:ascii="Courier New" w:hAnsi="Courier New" w:cs="Courier New" w:hint="default"/>
+      </w:rPr>
+    </w:lvl>
+    <w:lvl w:ilvl="2" w:tplc="04160005" w:tentative="1">
+      <w:start w:val="1"/>
+      <w:numFmt w:val="bullet"/>
+      <w:lvlText w:val=""/>
+      <w:lvlJc w:val="left"/>
+      <w:pPr>
+        <w:ind w:left="2160" w:hanging="360"/>
+      </w:pPr>
+      <w:rPr>
+        <w:rFonts w:ascii="Wingdings" w:hAnsi="Wingdings" w:hint="default"/>
+      </w:rPr>
+    </w:lvl>
+    <w:lvl w:ilvl="3" w:tplc="04160001" w:tentative="1">
+      <w:start w:val="1"/>
+      <w:numFmt w:val="bullet"/>
+      <w:lvlText w:val=""/>
+      <w:lvlJc w:val="left"/>
+      <w:pPr>
+        <w:ind w:left="2880" w:hanging="360"/>
+      </w:pPr>
+      <w:rPr>
+        <w:rFonts w:ascii="Symbol" w:hAnsi="Symbol" w:hint="default"/>
+      </w:rPr>
+    </w:lvl>
+    <w:lvl w:ilvl="4" w:tplc="04160003" w:tentative="1">
+      <w:start w:val="1"/>
+      <w:numFmt w:val="bullet"/>
+      <w:lvlText w:val="o"/>
+      <w:lvlJc w:val="left"/>
+      <w:pPr>
+        <w:ind w:left="3600" w:hanging="360"/>
+      </w:pPr>
+      <w:rPr>
+        <w:rFonts w:ascii="Courier New" w:hAnsi="Courier New" w:cs="Courier New" w:hint="default"/>
+      </w:rPr>
+    </w:lvl>
+    <w:lvl w:ilvl="5" w:tplc="04160005" w:tentative="1">
+      <w:start w:val="1"/>
+      <w:numFmt w:val="bullet"/>
+      <w:lvlText w:val=""/>
+      <w:lvlJc w:val="left"/>
+      <w:pPr>
+        <w:ind w:left="4320" w:hanging="360"/>
+      </w:pPr>
+      <w:rPr>
+        <w:rFonts w:ascii="Wingdings" w:hAnsi="Wingdings" w:hint="default"/>
+      </w:rPr>
+    </w:lvl>
+    <w:lvl w:ilvl="6" w:tplc="04160001" w:tentative="1">
+      <w:start w:val="1"/>
+      <w:numFmt w:val="bullet"/>
+      <w:lvlText w:val=""/>
+      <w:lvlJc w:val="left"/>
+      <w:pPr>
+        <w:ind w:left="5040" w:hanging="360"/>
+      </w:pPr>
+      <w:rPr>
+        <w:rFonts w:ascii="Symbol" w:hAnsi="Symbol" w:hint="default"/>
+      </w:rPr>
+    </w:lvl>
+    <w:lvl w:ilvl="7" w:tplc="04160003" w:tentative="1">
+      <w:start w:val="1"/>
+      <w:numFmt w:val="bullet"/>
+      <w:lvlText w:val="o"/>
+      <w:lvlJc w:val="left"/>
+      <w:pPr>
+        <w:ind w:left="5760" w:hanging="360"/>
+      </w:pPr>
+      <w:rPr>
+        <w:rFonts w:ascii="Courier New" w:hAnsi="Courier New" w:cs="Courier New" w:hint="default"/>
+      </w:rPr>
+    </w:lvl>
+    <w:lvl w:ilvl="8" w:tplc="04160005" w:tentative="1">
+      <w:start w:val="1"/>
+      <w:numFmt w:val="bullet"/>
+      <w:lvlText w:val=""/>
+      <w:lvlJc w:val="left"/>
+      <w:pPr>
+        <w:ind w:left="6480" w:hanging="360"/>
+      </w:pPr>
+      <w:rPr>
+        <w:rFonts w:ascii="Wingdings" w:hAnsi="Wingdings" w:hint="default"/>
+      </w:rPr>
+    </w:lvl>
+  </w:abstractNum>
+  <w:abstractNum w:abstractNumId="1" w15:restartNumberingAfterBreak="0">
     <w:nsid w:val="3EC13277"/>
     <w:multiLevelType w:val="multilevel"/>
     <w:tmpl w:val="79C4D912"/>
@@ -333,7 +532,7 @@
       </w:rPr>
     </w:lvl>
   </w:abstractNum>
-  <w:abstractNum w:abstractNumId="1" w15:restartNumberingAfterBreak="0">
+  <w:abstractNum w:abstractNumId="2" w15:restartNumberingAfterBreak="0">
     <w:nsid w:val="595B5039"/>
     <w:multiLevelType w:val="multilevel"/>
     <w:tmpl w:val="BFC0A39A"/>
@@ -447,9 +646,12 @@
     </w:lvl>
   </w:abstractNum>
   <w:num w:numId="1" w16cid:durableId="1651864898">
+    <w:abstractNumId w:val="2"/>
+  </w:num>
+  <w:num w:numId="2" w16cid:durableId="150873539">
     <w:abstractNumId w:val="1"/>
   </w:num>
-  <w:num w:numId="2" w16cid:durableId="150873539">
+  <w:num w:numId="3" w16cid:durableId="1956906992">
     <w:abstractNumId w:val="0"/>
   </w:num>
 </w:numbering>
@@ -1058,7 +1260,6 @@
   <w:style w:type="character" w:default="1" w:styleId="Fontepargpadro">
     <w:name w:val="Default Paragraph Font"/>
     <w:uiPriority w:val="1"/>
-    <w:semiHidden/>
     <w:unhideWhenUsed/>
   </w:style>
   <w:style w:type="table" w:default="1" w:styleId="Tabelanormal">

</xml_diff>

<commit_message>
v74 - Atualizacao do app
</commit_message>
<xml_diff>
--- a/comando de deploy.docx
+++ b/comando de deploy.docx
@@ -10,7 +10,15 @@
         </w:numPr>
       </w:pPr>
       <w:r>
-        <w:t>No VS Code, abra o </w:t>
+        <w:t xml:space="preserve">No VS </w:t>
+      </w:r>
+      <w:proofErr w:type="spellStart"/>
+      <w:r>
+        <w:t>Code</w:t>
+      </w:r>
+      <w:proofErr w:type="spellEnd"/>
+      <w:r>
+        <w:t>, abra o </w:t>
       </w:r>
       <w:r>
         <w:rPr>
@@ -37,7 +45,15 @@
         </w:numPr>
       </w:pPr>
       <w:r>
-        <w:t>Digite e pressione Enter:</w:t>
+        <w:t xml:space="preserve">Digite e pressione </w:t>
+      </w:r>
+      <w:proofErr w:type="spellStart"/>
+      <w:r>
+        <w:t>Enter</w:t>
+      </w:r>
+      <w:proofErr w:type="spellEnd"/>
+      <w:r>
+        <w:t>:</w:t>
       </w:r>
     </w:p>
     <w:p>
@@ -74,7 +90,15 @@
     </w:p>
     <w:p>
       <w:r>
-        <w:t>É isso! Sempre que quiser atualizar o app dos alunos, basta digitar esse comando no terminal do VS Code.</w:t>
+        <w:t xml:space="preserve">É isso! Sempre que quiser atualizar o app dos alunos, basta digitar esse comando no terminal do VS </w:t>
+      </w:r>
+      <w:proofErr w:type="spellStart"/>
+      <w:r>
+        <w:t>Code</w:t>
+      </w:r>
+      <w:proofErr w:type="spellEnd"/>
+      <w:r>
+        <w:t>.</w:t>
       </w:r>
     </w:p>
     <w:p/>
@@ -92,7 +116,31 @@
       </w:r>
       <w:r>
         <w:br/>
-        <w:t>O repositório está em mkodgssjb27-sketch/overlabs. Se o GitHub Pages está ativado (branch main), os links são:</w:t>
+        <w:t>O repositório está em mkodgssjb27-sketch/</w:t>
+      </w:r>
+      <w:proofErr w:type="spellStart"/>
+      <w:r>
+        <w:t>overlabs</w:t>
+      </w:r>
+      <w:proofErr w:type="spellEnd"/>
+      <w:r>
+        <w:t>. Se o GitHub Pages está ativado (</w:t>
+      </w:r>
+      <w:proofErr w:type="spellStart"/>
+      <w:r>
+        <w:t>branch</w:t>
+      </w:r>
+      <w:proofErr w:type="spellEnd"/>
+      <w:r>
+        <w:t xml:space="preserve"> </w:t>
+      </w:r>
+      <w:proofErr w:type="spellStart"/>
+      <w:r>
+        <w:t>main</w:t>
+      </w:r>
+      <w:proofErr w:type="spellEnd"/>
+      <w:r>
+        <w:t>), os links são:</w:t>
       </w:r>
     </w:p>
     <w:p/>
@@ -140,7 +188,31 @@
         <w:t>CUT</w:t>
       </w:r>
       <w:r>
-        <w:t xml:space="preserve"> – Agora seu aplicativo ficou mais dinâmico, implementada os CUT que são nada mais nada menos que as moedas que você pode acumular dentro do seu perfil no app da Over Labs, Você poderá usar Cuts para comprar Customizações para seu perfil na Loja.</w:t>
+        <w:t xml:space="preserve"> – Agora seu aplicativo ficou mais dinâmico, implementada os CUT que são nada mais nada menos que as moedas que você pode acumular dentro do seu perfil no app da Over </w:t>
+      </w:r>
+      <w:proofErr w:type="spellStart"/>
+      <w:r>
+        <w:t>Labs</w:t>
+      </w:r>
+      <w:proofErr w:type="spellEnd"/>
+      <w:r>
+        <w:t xml:space="preserve">, </w:t>
+      </w:r>
+      <w:proofErr w:type="gramStart"/>
+      <w:r>
+        <w:t>Você</w:t>
+      </w:r>
+      <w:proofErr w:type="gramEnd"/>
+      <w:r>
+        <w:t xml:space="preserve"> poderá usar </w:t>
+      </w:r>
+      <w:proofErr w:type="spellStart"/>
+      <w:r>
+        <w:t>Cuts</w:t>
+      </w:r>
+      <w:proofErr w:type="spellEnd"/>
+      <w:r>
+        <w:t xml:space="preserve"> para comprar Customizações para seu perfil na Loja.</w:t>
       </w:r>
       <w:r>
         <w:br/>
@@ -258,6 +330,9 @@
         <w:t>Ser Campeão batendo em Federado – 70</w:t>
       </w:r>
     </w:p>
+    <w:p/>
+    <w:p/>
+    <w:p/>
     <w:sectPr>
       <w:pgSz w:w="11906" w:h="16838"/>
       <w:pgMar w:top="1417" w:right="1701" w:bottom="1417" w:left="1701" w:header="708" w:footer="708" w:gutter="0"/>

</xml_diff>

<commit_message>
v155 - Presentear aluno, filtros Editor, ocultar itens, Log atividades, Stats Ranking
</commit_message>
<xml_diff>
--- a/comando de deploy.docx
+++ b/comando de deploy.docx
@@ -196,15 +196,7 @@
       </w:r>
       <w:proofErr w:type="spellEnd"/>
       <w:r>
-        <w:t xml:space="preserve">, </w:t>
-      </w:r>
-      <w:proofErr w:type="gramStart"/>
-      <w:r>
-        <w:t>Você</w:t>
-      </w:r>
-      <w:proofErr w:type="gramEnd"/>
-      <w:r>
-        <w:t xml:space="preserve"> poderá usar </w:t>
+        <w:t xml:space="preserve">, Você poderá usar </w:t>
       </w:r>
       <w:proofErr w:type="spellStart"/>
       <w:r>
@@ -332,7 +324,48 @@
     </w:p>
     <w:p/>
     <w:p/>
-    <w:p/>
+    <w:p>
+      <w:r>
+        <w:t>VAMOS AS COMPRAS!?</w:t>
+      </w:r>
+      <w:r>
+        <w:br/>
+        <w:t xml:space="preserve"> Chegou a função onde você irá gastar até o que não tem.</w:t>
+      </w:r>
+      <w:r>
+        <w:br/>
+      </w:r>
+      <w:r>
+        <w:br/>
+      </w:r>
+    </w:p>
+    <w:p>
+      <w:pPr>
+        <w:pStyle w:val="PargrafodaLista"/>
+        <w:numPr>
+          <w:ilvl w:val="0"/>
+          <w:numId w:val="4"/>
+        </w:numPr>
+        <w:rPr>
+          <w:b/>
+          <w:bCs/>
+        </w:rPr>
+      </w:pPr>
+      <w:r>
+        <w:rPr>
+          <w:b/>
+          <w:bCs/>
+        </w:rPr>
+        <w:t>MERCADO</w:t>
+      </w:r>
+      <w:r>
+        <w:rPr>
+          <w:b/>
+          <w:bCs/>
+        </w:rPr>
+        <w:t xml:space="preserve"> - </w:t>
+      </w:r>
+    </w:p>
     <w:sectPr>
       <w:pgSz w:w="11906" w:h="16838"/>
       <w:pgMar w:top="1417" w:right="1701" w:bottom="1417" w:left="1701" w:header="708" w:footer="708" w:gutter="0"/>
@@ -346,6 +379,119 @@
 <file path=word/numbering.xml><?xml version="1.0" encoding="utf-8"?>
 <w:numbering xmlns:wpc="http://schemas.microsoft.com/office/word/2010/wordprocessingCanvas" xmlns:cx="http://schemas.microsoft.com/office/drawing/2014/chartex" xmlns:cx1="http://schemas.microsoft.com/office/drawing/2015/9/8/chartex" xmlns:cx2="http://schemas.microsoft.com/office/drawing/2015/10/21/chartex" xmlns:cx3="http://schemas.microsoft.com/office/drawing/2016/5/9/chartex" xmlns:cx4="http://schemas.microsoft.com/office/drawing/2016/5/10/chartex" xmlns:cx5="http://schemas.microsoft.com/office/drawing/2016/5/11/chartex" xmlns:cx6="http://schemas.microsoft.com/office/drawing/2016/5/12/chartex" xmlns:cx7="http://schemas.microsoft.com/office/drawing/2016/5/13/chartex" xmlns:cx8="http://schemas.microsoft.com/office/drawing/2016/5/14/chartex" xmlns:mc="http://schemas.openxmlformats.org/markup-compatibility/2006" xmlns:aink="http://schemas.microsoft.com/office/drawing/2016/ink" xmlns:am3d="http://schemas.microsoft.com/office/drawing/2017/model3d" xmlns:o="urn:schemas-microsoft-com:office:office" xmlns:oel="http://schemas.microsoft.com/office/2019/extlst" xmlns:r="http://schemas.openxmlformats.org/officeDocument/2006/relationships" xmlns:m="http://schemas.openxmlformats.org/officeDocument/2006/math" xmlns:v="urn:schemas-microsoft-com:vml" xmlns:wp14="http://schemas.microsoft.com/office/word/2010/wordprocessingDrawing" xmlns:wp="http://schemas.openxmlformats.org/drawingml/2006/wordprocessingDrawing" xmlns:w10="urn:schemas-microsoft-com:office:word" xmlns:w="http://schemas.openxmlformats.org/wordprocessingml/2006/main" xmlns:w14="http://schemas.microsoft.com/office/word/2010/wordml" xmlns:w15="http://schemas.microsoft.com/office/word/2012/wordml" xmlns:w16cex="http://schemas.microsoft.com/office/word/2018/wordml/cex" xmlns:w16cid="http://schemas.microsoft.com/office/word/2016/wordml/cid" xmlns:w16="http://schemas.microsoft.com/office/word/2018/wordml" xmlns:w16du="http://schemas.microsoft.com/office/word/2023/wordml/word16du" xmlns:w16sdtdh="http://schemas.microsoft.com/office/word/2020/wordml/sdtdatahash" xmlns:w16sdtfl="http://schemas.microsoft.com/office/word/2024/wordml/sdtformatlock" xmlns:w16se="http://schemas.microsoft.com/office/word/2015/wordml/symex" xmlns:wpg="http://schemas.microsoft.com/office/word/2010/wordprocessingGroup" xmlns:wpi="http://schemas.microsoft.com/office/word/2010/wordprocessingInk" xmlns:wne="http://schemas.microsoft.com/office/word/2006/wordml" xmlns:wps="http://schemas.microsoft.com/office/word/2010/wordprocessingShape" mc:Ignorable="w14 w15 w16se w16cid w16 w16cex w16sdtdh w16sdtfl w16du wp14">
   <w:abstractNum w:abstractNumId="0" w15:restartNumberingAfterBreak="0">
+    <w:nsid w:val="19811987"/>
+    <w:multiLevelType w:val="hybridMultilevel"/>
+    <w:tmpl w:val="318E5C58"/>
+    <w:lvl w:ilvl="0" w:tplc="04160001">
+      <w:start w:val="1"/>
+      <w:numFmt w:val="bullet"/>
+      <w:lvlText w:val=""/>
+      <w:lvlJc w:val="left"/>
+      <w:pPr>
+        <w:ind w:left="720" w:hanging="360"/>
+      </w:pPr>
+      <w:rPr>
+        <w:rFonts w:ascii="Symbol" w:hAnsi="Symbol" w:hint="default"/>
+      </w:rPr>
+    </w:lvl>
+    <w:lvl w:ilvl="1" w:tplc="04160003" w:tentative="1">
+      <w:start w:val="1"/>
+      <w:numFmt w:val="bullet"/>
+      <w:lvlText w:val="o"/>
+      <w:lvlJc w:val="left"/>
+      <w:pPr>
+        <w:ind w:left="1440" w:hanging="360"/>
+      </w:pPr>
+      <w:rPr>
+        <w:rFonts w:ascii="Courier New" w:hAnsi="Courier New" w:cs="Courier New" w:hint="default"/>
+      </w:rPr>
+    </w:lvl>
+    <w:lvl w:ilvl="2" w:tplc="04160005" w:tentative="1">
+      <w:start w:val="1"/>
+      <w:numFmt w:val="bullet"/>
+      <w:lvlText w:val=""/>
+      <w:lvlJc w:val="left"/>
+      <w:pPr>
+        <w:ind w:left="2160" w:hanging="360"/>
+      </w:pPr>
+      <w:rPr>
+        <w:rFonts w:ascii="Wingdings" w:hAnsi="Wingdings" w:hint="default"/>
+      </w:rPr>
+    </w:lvl>
+    <w:lvl w:ilvl="3" w:tplc="04160001" w:tentative="1">
+      <w:start w:val="1"/>
+      <w:numFmt w:val="bullet"/>
+      <w:lvlText w:val=""/>
+      <w:lvlJc w:val="left"/>
+      <w:pPr>
+        <w:ind w:left="2880" w:hanging="360"/>
+      </w:pPr>
+      <w:rPr>
+        <w:rFonts w:ascii="Symbol" w:hAnsi="Symbol" w:hint="default"/>
+      </w:rPr>
+    </w:lvl>
+    <w:lvl w:ilvl="4" w:tplc="04160003" w:tentative="1">
+      <w:start w:val="1"/>
+      <w:numFmt w:val="bullet"/>
+      <w:lvlText w:val="o"/>
+      <w:lvlJc w:val="left"/>
+      <w:pPr>
+        <w:ind w:left="3600" w:hanging="360"/>
+      </w:pPr>
+      <w:rPr>
+        <w:rFonts w:ascii="Courier New" w:hAnsi="Courier New" w:cs="Courier New" w:hint="default"/>
+      </w:rPr>
+    </w:lvl>
+    <w:lvl w:ilvl="5" w:tplc="04160005" w:tentative="1">
+      <w:start w:val="1"/>
+      <w:numFmt w:val="bullet"/>
+      <w:lvlText w:val=""/>
+      <w:lvlJc w:val="left"/>
+      <w:pPr>
+        <w:ind w:left="4320" w:hanging="360"/>
+      </w:pPr>
+      <w:rPr>
+        <w:rFonts w:ascii="Wingdings" w:hAnsi="Wingdings" w:hint="default"/>
+      </w:rPr>
+    </w:lvl>
+    <w:lvl w:ilvl="6" w:tplc="04160001" w:tentative="1">
+      <w:start w:val="1"/>
+      <w:numFmt w:val="bullet"/>
+      <w:lvlText w:val=""/>
+      <w:lvlJc w:val="left"/>
+      <w:pPr>
+        <w:ind w:left="5040" w:hanging="360"/>
+      </w:pPr>
+      <w:rPr>
+        <w:rFonts w:ascii="Symbol" w:hAnsi="Symbol" w:hint="default"/>
+      </w:rPr>
+    </w:lvl>
+    <w:lvl w:ilvl="7" w:tplc="04160003" w:tentative="1">
+      <w:start w:val="1"/>
+      <w:numFmt w:val="bullet"/>
+      <w:lvlText w:val="o"/>
+      <w:lvlJc w:val="left"/>
+      <w:pPr>
+        <w:ind w:left="5760" w:hanging="360"/>
+      </w:pPr>
+      <w:rPr>
+        <w:rFonts w:ascii="Courier New" w:hAnsi="Courier New" w:cs="Courier New" w:hint="default"/>
+      </w:rPr>
+    </w:lvl>
+    <w:lvl w:ilvl="8" w:tplc="04160005" w:tentative="1">
+      <w:start w:val="1"/>
+      <w:numFmt w:val="bullet"/>
+      <w:lvlText w:val=""/>
+      <w:lvlJc w:val="left"/>
+      <w:pPr>
+        <w:ind w:left="6480" w:hanging="360"/>
+      </w:pPr>
+      <w:rPr>
+        <w:rFonts w:ascii="Wingdings" w:hAnsi="Wingdings" w:hint="default"/>
+      </w:rPr>
+    </w:lvl>
+  </w:abstractNum>
+  <w:abstractNum w:abstractNumId="1" w15:restartNumberingAfterBreak="0">
     <w:nsid w:val="22524C54"/>
     <w:multiLevelType w:val="hybridMultilevel"/>
     <w:tmpl w:val="5636C4BC"/>
@@ -458,7 +604,7 @@
       </w:rPr>
     </w:lvl>
   </w:abstractNum>
-  <w:abstractNum w:abstractNumId="1" w15:restartNumberingAfterBreak="0">
+  <w:abstractNum w:abstractNumId="2" w15:restartNumberingAfterBreak="0">
     <w:nsid w:val="3EC13277"/>
     <w:multiLevelType w:val="multilevel"/>
     <w:tmpl w:val="79C4D912"/>
@@ -607,7 +753,7 @@
       </w:rPr>
     </w:lvl>
   </w:abstractNum>
-  <w:abstractNum w:abstractNumId="2" w15:restartNumberingAfterBreak="0">
+  <w:abstractNum w:abstractNumId="3" w15:restartNumberingAfterBreak="0">
     <w:nsid w:val="595B5039"/>
     <w:multiLevelType w:val="multilevel"/>
     <w:tmpl w:val="BFC0A39A"/>
@@ -721,12 +867,15 @@
     </w:lvl>
   </w:abstractNum>
   <w:num w:numId="1" w16cid:durableId="1651864898">
+    <w:abstractNumId w:val="3"/>
+  </w:num>
+  <w:num w:numId="2" w16cid:durableId="150873539">
     <w:abstractNumId w:val="2"/>
   </w:num>
-  <w:num w:numId="2" w16cid:durableId="150873539">
+  <w:num w:numId="3" w16cid:durableId="1956906992">
     <w:abstractNumId w:val="1"/>
   </w:num>
-  <w:num w:numId="3" w16cid:durableId="1956906992">
+  <w:num w:numId="4" w16cid:durableId="1217937295">
     <w:abstractNumId w:val="0"/>
   </w:num>
 </w:numbering>

</xml_diff>

<commit_message>
v221 - Atualizacao do app
</commit_message>
<xml_diff>
--- a/comando de deploy.docx
+++ b/comando de deploy.docx
@@ -10,15 +10,7 @@
         </w:numPr>
       </w:pPr>
       <w:r>
-        <w:t xml:space="preserve">No VS </w:t>
-      </w:r>
-      <w:proofErr w:type="spellStart"/>
-      <w:r>
-        <w:t>Code</w:t>
-      </w:r>
-      <w:proofErr w:type="spellEnd"/>
-      <w:r>
-        <w:t>, abra o </w:t>
+        <w:t>No VS Code, abra o </w:t>
       </w:r>
       <w:r>
         <w:rPr>
@@ -45,15 +37,7 @@
         </w:numPr>
       </w:pPr>
       <w:r>
-        <w:t xml:space="preserve">Digite e pressione </w:t>
-      </w:r>
-      <w:proofErr w:type="spellStart"/>
-      <w:r>
-        <w:t>Enter</w:t>
-      </w:r>
-      <w:proofErr w:type="spellEnd"/>
-      <w:r>
-        <w:t>:</w:t>
+        <w:t>Digite e pressione Enter:</w:t>
       </w:r>
     </w:p>
     <w:p>
@@ -90,15 +74,7 @@
     </w:p>
     <w:p>
       <w:r>
-        <w:t xml:space="preserve">É isso! Sempre que quiser atualizar o app dos alunos, basta digitar esse comando no terminal do VS </w:t>
-      </w:r>
-      <w:proofErr w:type="spellStart"/>
-      <w:r>
-        <w:t>Code</w:t>
-      </w:r>
-      <w:proofErr w:type="spellEnd"/>
-      <w:r>
-        <w:t>.</w:t>
+        <w:t>É isso! Sempre que quiser atualizar o app dos alunos, basta digitar esse comando no terminal do VS Code.</w:t>
       </w:r>
     </w:p>
     <w:p/>
@@ -116,31 +92,7 @@
       </w:r>
       <w:r>
         <w:br/>
-        <w:t>O repositório está em mkodgssjb27-sketch/</w:t>
-      </w:r>
-      <w:proofErr w:type="spellStart"/>
-      <w:r>
-        <w:t>overlabs</w:t>
-      </w:r>
-      <w:proofErr w:type="spellEnd"/>
-      <w:r>
-        <w:t>. Se o GitHub Pages está ativado (</w:t>
-      </w:r>
-      <w:proofErr w:type="spellStart"/>
-      <w:r>
-        <w:t>branch</w:t>
-      </w:r>
-      <w:proofErr w:type="spellEnd"/>
-      <w:r>
-        <w:t xml:space="preserve"> </w:t>
-      </w:r>
-      <w:proofErr w:type="spellStart"/>
-      <w:r>
-        <w:t>main</w:t>
-      </w:r>
-      <w:proofErr w:type="spellEnd"/>
-      <w:r>
-        <w:t>), os links são:</w:t>
+        <w:t>O repositório está em mkodgssjb27-sketch/overlabs. Se o GitHub Pages está ativado (branch main), os links são:</w:t>
       </w:r>
     </w:p>
     <w:p/>
@@ -173,197 +125,8 @@
     </w:p>
     <w:p/>
     <w:p>
-      <w:pPr>
-        <w:pStyle w:val="PargrafodaLista"/>
-        <w:numPr>
-          <w:ilvl w:val="0"/>
-          <w:numId w:val="3"/>
-        </w:numPr>
-      </w:pPr>
       <w:r>
-        <w:rPr>
-          <w:b/>
-          <w:bCs/>
-        </w:rPr>
-        <w:t>CUT</w:t>
-      </w:r>
-      <w:r>
-        <w:t xml:space="preserve"> – Agora seu aplicativo ficou mais dinâmico, implementada os CUT que são nada mais nada menos que as moedas que você pode acumular dentro do seu perfil no app da Over </w:t>
-      </w:r>
-      <w:proofErr w:type="spellStart"/>
-      <w:r>
-        <w:t>Labs</w:t>
-      </w:r>
-      <w:proofErr w:type="spellEnd"/>
-      <w:r>
-        <w:t xml:space="preserve">, Você poderá usar </w:t>
-      </w:r>
-      <w:proofErr w:type="spellStart"/>
-      <w:r>
-        <w:t>Cuts</w:t>
-      </w:r>
-      <w:proofErr w:type="spellEnd"/>
-      <w:r>
-        <w:t xml:space="preserve"> para comprar Customizações para seu perfil na Loja.</w:t>
-      </w:r>
-      <w:r>
-        <w:br/>
-      </w:r>
-    </w:p>
-    <w:p>
-      <w:pPr>
-        <w:pStyle w:val="PargrafodaLista"/>
-        <w:numPr>
-          <w:ilvl w:val="0"/>
-          <w:numId w:val="3"/>
-        </w:numPr>
-      </w:pPr>
-      <w:r>
-        <w:rPr>
-          <w:b/>
-          <w:bCs/>
-        </w:rPr>
-        <w:t>PRESENÇAS</w:t>
-      </w:r>
-      <w:r>
-        <w:t xml:space="preserve"> – Agora na aba presenças você poderá acompanhar seu próprio Histórico de frequência, assim que o treino é finalizado, sua presença é lançada dentro do Aplicativo.</w:t>
-      </w:r>
-      <w:r>
-        <w:br/>
-        <w:t>ATENÇÃO! Presenças valerão CUTS (sistema de moeda dentro do Aplicativo), portanto, quanto mais presente nos treinos você é, mas moedas irá acumular.</w:t>
-      </w:r>
-    </w:p>
-    <w:p>
-      <w:pPr>
-        <w:pStyle w:val="PargrafodaLista"/>
-        <w:numPr>
-          <w:ilvl w:val="0"/>
-          <w:numId w:val="3"/>
-        </w:numPr>
-      </w:pPr>
-      <w:r>
-        <w:rPr>
-          <w:b/>
-          <w:bCs/>
-        </w:rPr>
-        <w:lastRenderedPageBreak/>
-        <w:t>TORNEIOS</w:t>
-      </w:r>
-      <w:r>
-        <w:t xml:space="preserve"> – Adicionada a opção Inscrições dentro da aba torneios, como funcionará: quando surgir um novo torneio, haverá uma ficha de inscrição com nome dele disponível para o aluno preencher e se inscrever para competir.</w:t>
-      </w:r>
-      <w:r>
-        <w:br/>
-      </w:r>
-      <w:r>
-        <w:br/>
-      </w:r>
-    </w:p>
-    <w:p>
-      <w:r>
-        <w:br/>
-      </w:r>
-      <w:r>
-        <w:t>VALORES DE MOEDAS CUT:</w:t>
-      </w:r>
-    </w:p>
-    <w:p>
-      <w:r>
-        <w:br/>
-      </w:r>
-      <w:r>
-        <w:t>Colocar Foto de Perfil – 1</w:t>
-      </w:r>
-      <w:r>
-        <w:br/>
-      </w:r>
-      <w:r>
-        <w:t>Treinar na Arena Cajueiro – 1</w:t>
-      </w:r>
-      <w:r>
-        <w:br/>
-      </w:r>
-      <w:r>
-        <w:t>Treinar na Arena Grussaí – 2</w:t>
-      </w:r>
-      <w:r>
-        <w:br/>
-      </w:r>
-      <w:r>
-        <w:t>Conseguir ir em uma Carona – 2</w:t>
-      </w:r>
-      <w:r>
-        <w:br/>
-      </w:r>
-      <w:r>
-        <w:t>Ficar em Terceiro em algum Torneio – 30</w:t>
-      </w:r>
-      <w:r>
-        <w:br/>
-      </w:r>
-      <w:r>
-        <w:t>Ficar Segundo em algum Torneio – 40</w:t>
-      </w:r>
-      <w:r>
-        <w:br/>
-      </w:r>
-      <w:r>
-        <w:t xml:space="preserve">Ser Campeão de Algum Torneio </w:t>
-      </w:r>
-      <w:r>
-        <w:t>–</w:t>
-      </w:r>
-      <w:r>
-        <w:t xml:space="preserve"> 50</w:t>
-      </w:r>
-    </w:p>
-    <w:p>
-      <w:r>
-        <w:t>Ser Campeão batendo em Federado – 70</w:t>
-      </w:r>
-    </w:p>
-    <w:p/>
-    <w:p/>
-    <w:p>
-      <w:r>
-        <w:t>VAMOS AS COMPRAS!?</w:t>
-      </w:r>
-      <w:r>
-        <w:br/>
-        <w:t xml:space="preserve"> Chegou a função onde você irá gastar até o que não tem.</w:t>
-      </w:r>
-      <w:r>
-        <w:br/>
-      </w:r>
-      <w:r>
-        <w:br/>
-      </w:r>
-    </w:p>
-    <w:p>
-      <w:pPr>
-        <w:pStyle w:val="PargrafodaLista"/>
-        <w:numPr>
-          <w:ilvl w:val="0"/>
-          <w:numId w:val="4"/>
-        </w:numPr>
-        <w:rPr>
-          <w:b/>
-          <w:bCs/>
-        </w:rPr>
-      </w:pPr>
-      <w:r>
-        <w:rPr>
-          <w:b/>
-          <w:bCs/>
-        </w:rPr>
-        <w:t>MERCADO</w:t>
-      </w:r>
-      <w:r>
-        <w:rPr>
-          <w:b/>
-          <w:bCs/>
-        </w:rPr>
-        <w:t xml:space="preserve"> - </w:t>
+        <w:t>Giovane durafort</w:t>
       </w:r>
     </w:p>
     <w:sectPr>

</xml_diff>

<commit_message>
v223 - Cambio - sistema de revenda de itens por CUTS
</commit_message>
<xml_diff>
--- a/comando de deploy.docx
+++ b/comando de deploy.docx
@@ -10,7 +10,15 @@
         </w:numPr>
       </w:pPr>
       <w:r>
-        <w:t>No VS Code, abra o </w:t>
+        <w:t xml:space="preserve">No VS </w:t>
+      </w:r>
+      <w:proofErr w:type="spellStart"/>
+      <w:r>
+        <w:t>Code</w:t>
+      </w:r>
+      <w:proofErr w:type="spellEnd"/>
+      <w:r>
+        <w:t>, abra o </w:t>
       </w:r>
       <w:r>
         <w:rPr>
@@ -37,7 +45,15 @@
         </w:numPr>
       </w:pPr>
       <w:r>
-        <w:t>Digite e pressione Enter:</w:t>
+        <w:t xml:space="preserve">Digite e pressione </w:t>
+      </w:r>
+      <w:proofErr w:type="spellStart"/>
+      <w:r>
+        <w:t>Enter</w:t>
+      </w:r>
+      <w:proofErr w:type="spellEnd"/>
+      <w:r>
+        <w:t>:</w:t>
       </w:r>
     </w:p>
     <w:p>
@@ -74,7 +90,15 @@
     </w:p>
     <w:p>
       <w:r>
-        <w:t>É isso! Sempre que quiser atualizar o app dos alunos, basta digitar esse comando no terminal do VS Code.</w:t>
+        <w:t xml:space="preserve">É isso! Sempre que quiser atualizar o app dos alunos, basta digitar esse comando no terminal do VS </w:t>
+      </w:r>
+      <w:proofErr w:type="spellStart"/>
+      <w:r>
+        <w:t>Code</w:t>
+      </w:r>
+      <w:proofErr w:type="spellEnd"/>
+      <w:r>
+        <w:t>.</w:t>
       </w:r>
     </w:p>
     <w:p/>
@@ -92,7 +116,31 @@
       </w:r>
       <w:r>
         <w:br/>
-        <w:t>O repositório está em mkodgssjb27-sketch/overlabs. Se o GitHub Pages está ativado (branch main), os links são:</w:t>
+        <w:t>O repositório está em mkodgssjb27-sketch/</w:t>
+      </w:r>
+      <w:proofErr w:type="spellStart"/>
+      <w:r>
+        <w:t>overlabs</w:t>
+      </w:r>
+      <w:proofErr w:type="spellEnd"/>
+      <w:r>
+        <w:t>. Se o GitHub Pages está ativado (</w:t>
+      </w:r>
+      <w:proofErr w:type="spellStart"/>
+      <w:r>
+        <w:t>branch</w:t>
+      </w:r>
+      <w:proofErr w:type="spellEnd"/>
+      <w:r>
+        <w:t xml:space="preserve"> </w:t>
+      </w:r>
+      <w:proofErr w:type="spellStart"/>
+      <w:r>
+        <w:t>main</w:t>
+      </w:r>
+      <w:proofErr w:type="spellEnd"/>
+      <w:r>
+        <w:t>), os links são:</w:t>
       </w:r>
     </w:p>
     <w:p/>
@@ -126,9 +174,18 @@
     <w:p/>
     <w:p>
       <w:r>
-        <w:t>Giovane durafort</w:t>
-      </w:r>
+        <w:t xml:space="preserve">Giovane </w:t>
+      </w:r>
+      <w:proofErr w:type="spellStart"/>
+      <w:r>
+        <w:t>durafort</w:t>
+      </w:r>
+      <w:proofErr w:type="spellEnd"/>
     </w:p>
+    <w:p/>
+    <w:p/>
+    <w:p/>
+    <w:p/>
     <w:sectPr>
       <w:pgSz w:w="11906" w:h="16838"/>
       <w:pgMar w:top="1417" w:right="1701" w:bottom="1417" w:left="1701" w:header="708" w:footer="708" w:gutter="0"/>

</xml_diff>